<commit_message>
Finished grobschrift of request lifecycle
</commit_message>
<xml_diff>
--- a/Laravel.docx
+++ b/Laravel.docx
@@ -4,44 +4,24 @@
   <w:body>
     <w:p>
       <w:pPr>
-        <w:pStyle w:val="Heading1"/>
-      </w:pPr>
-      <w:r>
-        <w:t xml:space="preserve">Architettura del Framework </w:t>
-      </w:r>
-      <w:proofErr w:type="spellStart"/>
-      <w:r>
-        <w:t>Laravel</w:t>
-      </w:r>
-      <w:proofErr w:type="spellEnd"/>
-    </w:p>
-    <w:p>
-      <w:proofErr w:type="spellStart"/>
-      <w:r>
-        <w:t>Laravel</w:t>
-      </w:r>
-      <w:proofErr w:type="spellEnd"/>
-      <w:r>
-        <w:t xml:space="preserve"> è un framework </w:t>
-      </w:r>
-      <w:r>
-        <w:t>full-</w:t>
-      </w:r>
-      <w:proofErr w:type="spellStart"/>
-      <w:r>
-        <w:t>stack</w:t>
-      </w:r>
-      <w:proofErr w:type="spellEnd"/>
+        <w:pStyle w:val="Titolo1"/>
+      </w:pPr>
+      <w:r>
+        <w:t>Architettura del Framework Laravel</w:t>
+      </w:r>
+    </w:p>
+    <w:p>
+      <w:r>
+        <w:t xml:space="preserve">Laravel è un framework </w:t>
+      </w:r>
+      <w:r>
+        <w:t>full-stack</w:t>
+      </w:r>
       <w:r>
         <w:t xml:space="preserve"> open source scritto in PHP. </w:t>
       </w:r>
-      <w:proofErr w:type="spellStart"/>
-      <w:r>
-        <w:t>Laravel</w:t>
-      </w:r>
-      <w:proofErr w:type="spellEnd"/>
-      <w:r>
-        <w:t xml:space="preserve"> è al momento s</w:t>
+      <w:r>
+        <w:t>Laravel è al momento s</w:t>
       </w:r>
       <w:r>
         <w:t xml:space="preserve">econdo </w:t>
@@ -49,7 +29,6 @@
       <w:r>
         <w:t xml:space="preserve">le indagini di mercato condotte annualmente da </w:t>
       </w:r>
-      <w:proofErr w:type="spellStart"/>
       <w:r>
         <w:rPr>
           <w:i/>
@@ -57,7 +36,6 @@
         </w:rPr>
         <w:t>JetBrains</w:t>
       </w:r>
-      <w:proofErr w:type="spellEnd"/>
       <w:r>
         <w:t xml:space="preserve"> (all'interno del report </w:t>
       </w:r>
@@ -66,17 +44,8 @@
           <w:i/>
           <w:iCs/>
         </w:rPr>
-        <w:t xml:space="preserve">State of Developer </w:t>
-      </w:r>
-      <w:proofErr w:type="spellStart"/>
-      <w:r>
-        <w:rPr>
-          <w:i/>
-          <w:iCs/>
-        </w:rPr>
-        <w:t>Ecosystem</w:t>
-      </w:r>
-      <w:proofErr w:type="spellEnd"/>
+        <w:t>State of Developer Ecosystem</w:t>
+      </w:r>
       <w:r>
         <w:rPr>
           <w:i/>
@@ -90,36 +59,12 @@
     </w:p>
     <w:p>
       <w:r>
-        <w:t xml:space="preserve">Il suo obiettivo primario è garantire una "developer </w:t>
-      </w:r>
-      <w:proofErr w:type="spellStart"/>
-      <w:r>
-        <w:t>experience</w:t>
-      </w:r>
-      <w:proofErr w:type="spellEnd"/>
-      <w:r>
-        <w:t>" eccellente, mettendo a disposizione strumenti potenti e raffinati per gestire la complessità delle applicazioni moderne.</w:t>
-      </w:r>
-    </w:p>
-    <w:p>
-      <w:r>
-        <w:t xml:space="preserve">Inoltre, </w:t>
-      </w:r>
-      <w:proofErr w:type="spellStart"/>
-      <w:r>
-        <w:t>Laravel</w:t>
-      </w:r>
-      <w:proofErr w:type="spellEnd"/>
-      <w:r>
-        <w:t xml:space="preserve"> si definisce un framework progressivo, scalabile e community </w:t>
-      </w:r>
-      <w:proofErr w:type="spellStart"/>
-      <w:r>
-        <w:t>driven</w:t>
-      </w:r>
-      <w:proofErr w:type="spellEnd"/>
-      <w:r>
-        <w:t xml:space="preserve">. Progressivo, dato </w:t>
+        <w:t>Il suo obiettivo primario è garantire una "developer experience" eccellente, mettendo a disposizione strumenti potenti e raffinati per gestire la complessità delle applicazioni moderne.</w:t>
+      </w:r>
+    </w:p>
+    <w:p>
+      <w:r>
+        <w:t xml:space="preserve">Inoltre, Laravel si definisce un framework progressivo, scalabile e community driven. Progressivo, dato </w:t>
       </w:r>
       <w:r>
         <w:t>è stato ideato per crescere insieme allo sviluppatore web ed alle esigenze del progetto, risultando accessibile si</w:t>
@@ -128,37 +73,16 @@
         <w:t>a</w:t>
       </w:r>
       <w:r>
-        <w:t xml:space="preserve"> per sviluppatori junior, offrendo però strumenti robusti per lo sviluppo di applicazioni di livello </w:t>
-      </w:r>
-      <w:proofErr w:type="spellStart"/>
-      <w:r>
-        <w:t>enterprise</w:t>
-      </w:r>
-      <w:proofErr w:type="spellEnd"/>
+        <w:t xml:space="preserve"> per sviluppatori junior, offrendo però strumenti robusti per lo sviluppo di applicazioni di livello enterprise</w:t>
+      </w:r>
       <w:r>
         <w:t xml:space="preserve">. Scalabile, invece </w:t>
       </w:r>
       <w:r>
-        <w:t xml:space="preserve">grazie alle caratteristiche di PHP e al supporto integrato per sistemi di cache distribuita e veloce come </w:t>
-      </w:r>
-      <w:proofErr w:type="spellStart"/>
-      <w:r>
-        <w:t>Redis</w:t>
-      </w:r>
-      <w:proofErr w:type="spellEnd"/>
-      <w:r>
-        <w:t>, che facilitano lo scaling orizzontale</w:t>
-      </w:r>
-      <w:r>
-        <w:t xml:space="preserve"> ed infine community </w:t>
-      </w:r>
-      <w:proofErr w:type="spellStart"/>
-      <w:r>
-        <w:t>driven</w:t>
-      </w:r>
-      <w:proofErr w:type="spellEnd"/>
-      <w:r>
-        <w:t>, dato che si basa sul contributo di migliaia di sviluppatori in tutto il mondo.</w:t>
+        <w:t>grazie alle caratteristiche di PHP e al supporto integrato per sistemi di cache distribuita e veloce come Redis, che facilitano lo scaling orizzontale</w:t>
+      </w:r>
+      <w:r>
+        <w:t xml:space="preserve"> ed infine community driven, dato che si basa sul contributo di migliaia di sviluppatori in tutto il mondo.</w:t>
       </w:r>
     </w:p>
     <w:p>
@@ -169,23 +93,7 @@
         <w:t>del framework è progettata per garantire</w:t>
       </w:r>
       <w:r>
-        <w:t xml:space="preserve"> una rigorosa separazione delle responsabilità (</w:t>
-      </w:r>
-      <w:proofErr w:type="spellStart"/>
-      <w:r>
-        <w:t>Separation</w:t>
-      </w:r>
-      <w:proofErr w:type="spellEnd"/>
-      <w:r>
-        <w:t xml:space="preserve"> of </w:t>
-      </w:r>
-      <w:proofErr w:type="spellStart"/>
-      <w:r>
-        <w:t>Concerns</w:t>
-      </w:r>
-      <w:proofErr w:type="spellEnd"/>
-      <w:r>
-        <w:t xml:space="preserve">). </w:t>
+        <w:t xml:space="preserve"> una rigorosa separazione delle responsabilità (Separation of Concerns). </w:t>
       </w:r>
       <w:r>
         <w:t xml:space="preserve">Questo obiettivo viene </w:t>
@@ -209,15 +117,7 @@
         <w:t>:</w:t>
       </w:r>
       <w:r>
-        <w:t xml:space="preserve"> la gestione del </w:t>
-      </w:r>
-      <w:proofErr w:type="spellStart"/>
-      <w:r>
-        <w:t>routing</w:t>
-      </w:r>
-      <w:proofErr w:type="spellEnd"/>
-      <w:r>
-        <w:t xml:space="preserve"> per l’instradamento delle richieste</w:t>
+        <w:t xml:space="preserve"> la gestione del routing per l’instradamento delle richieste</w:t>
       </w:r>
       <w:r>
         <w:t xml:space="preserve"> HTTP</w:t>
@@ -232,26 +132,14 @@
         <w:t xml:space="preserve"> </w:t>
       </w:r>
       <w:r>
-        <w:t>tramite il meccanismo di</w:t>
-      </w:r>
-      <w:r>
-        <w:t xml:space="preserve"> </w:t>
-      </w:r>
-      <w:proofErr w:type="spellStart"/>
+        <w:t xml:space="preserve">tramite il meccanismo di </w:t>
+      </w:r>
       <w:r>
         <w:rPr>
           <w:i/>
           <w:iCs/>
         </w:rPr>
-        <w:t>Dependency</w:t>
-      </w:r>
-      <w:proofErr w:type="spellEnd"/>
-      <w:r>
-        <w:rPr>
-          <w:i/>
-          <w:iCs/>
-        </w:rPr>
-        <w:t xml:space="preserve"> Injection</w:t>
+        <w:t>Dependency Injection</w:t>
       </w:r>
       <w:r>
         <w:t>,</w:t>
@@ -281,13 +169,22 @@
     <w:p/>
     <w:p>
       <w:pPr>
-        <w:pStyle w:val="Heading2"/>
-      </w:pPr>
-      <w:r>
-        <w:t>Il Pattern Architetturale MVC (Model-View-Controller</w:t>
-      </w:r>
-      <w:r>
-        <w:t>)</w:t>
+        <w:pStyle w:val="Titolo2"/>
+      </w:pPr>
+      <w:r>
+        <w:t xml:space="preserve">Il </w:t>
+      </w:r>
+      <w:r>
+        <w:t>p</w:t>
+      </w:r>
+      <w:r>
+        <w:t xml:space="preserve">attern </w:t>
+      </w:r>
+      <w:r>
+        <w:t>a</w:t>
+      </w:r>
+      <w:r>
+        <w:t xml:space="preserve">rchitetturale MVC </w:t>
       </w:r>
     </w:p>
     <w:p>
@@ -297,15 +194,7 @@
         </w:rPr>
       </w:pPr>
       <w:r>
-        <w:t xml:space="preserve">Il framework </w:t>
-      </w:r>
-      <w:proofErr w:type="spellStart"/>
-      <w:r>
-        <w:t>Laravel</w:t>
-      </w:r>
-      <w:proofErr w:type="spellEnd"/>
-      <w:r>
-        <w:t xml:space="preserve"> adotta nativamente il pattern architetturale Model-View-Controller (MVC) per separare in modo netto la logica di presentazione dalla logica di business e </w:t>
+        <w:t xml:space="preserve">Il framework Laravel adotta nativamente il pattern architetturale Model-View-Controller (MVC) per separare in modo netto la logica di presentazione dalla logica di business e </w:t>
       </w:r>
       <w:r>
         <w:t xml:space="preserve">di </w:t>
@@ -347,82 +236,51 @@
         <w:t>“</w:t>
       </w:r>
       <w:r>
+        <w:t>.blade.php</w:t>
+      </w:r>
+      <w:r>
+        <w:t>”</w:t>
+      </w:r>
+      <w:r>
+        <w:t>, genera dinamicamente il codice HTML</w:t>
+      </w:r>
+      <w:r>
+        <w:t xml:space="preserve">. Questi file vengono salvati tipicamente nella directory </w:t>
+      </w:r>
+      <w:r>
+        <w:t>resources/views</w:t>
+      </w:r>
+      <w:r>
         <w:t>.</w:t>
       </w:r>
-      <w:proofErr w:type="spellStart"/>
-      <w:r>
-        <w:t>blade.php</w:t>
-      </w:r>
-      <w:proofErr w:type="spellEnd"/>
-      <w:r>
-        <w:t>”</w:t>
-      </w:r>
-      <w:r>
-        <w:t>, genera dinamicamente il codice HTML</w:t>
-      </w:r>
-      <w:r>
-        <w:t xml:space="preserve">. Questi file vengono salvati tipicamente nella directory </w:t>
-      </w:r>
-      <w:proofErr w:type="spellStart"/>
-      <w:r>
-        <w:t>resources</w:t>
-      </w:r>
-      <w:proofErr w:type="spellEnd"/>
-      <w:r>
-        <w:t>/</w:t>
-      </w:r>
-      <w:proofErr w:type="spellStart"/>
-      <w:r>
-        <w:t>views</w:t>
-      </w:r>
-      <w:proofErr w:type="spellEnd"/>
+      <w:r>
+        <w:t xml:space="preserve"> Blade è un </w:t>
+      </w:r>
+      <w:r>
+        <w:t>motore template molto leggero, accetta codice PHP puro all’interno del</w:t>
+      </w:r>
+      <w:r>
+        <w:t xml:space="preserve">le viste </w:t>
+      </w:r>
+      <w:r>
+        <w:t xml:space="preserve">e compila le viste in codice PHP che </w:t>
+      </w:r>
+      <w:r>
+        <w:t xml:space="preserve">vengono </w:t>
+      </w:r>
+      <w:r>
+        <w:t>memorizzati nella cache finché non vengono modificati, il che significa che Blade non aggiunge praticamente alcun sovraccarico all</w:t>
+      </w:r>
+      <w:r>
+        <w:t>’applicazione</w:t>
+      </w:r>
       <w:r>
         <w:t>.</w:t>
       </w:r>
-      <w:r>
-        <w:t xml:space="preserve"> Blade è un </w:t>
-      </w:r>
-      <w:r>
-        <w:t>motore template molto leggero, accetta codice PHP puro all’interno del</w:t>
-      </w:r>
-      <w:r>
-        <w:t xml:space="preserve">le viste </w:t>
-      </w:r>
-      <w:r>
-        <w:t xml:space="preserve">e compila le viste in codice PHP che </w:t>
-      </w:r>
-      <w:r>
-        <w:t xml:space="preserve">vengono </w:t>
-      </w:r>
-      <w:r>
-        <w:t>memorizzati nella cache finché non vengono modificati, il che significa che Blade non aggiunge praticamente alcun sovraccarico all</w:t>
-      </w:r>
-      <w:r>
-        <w:t>’applicazione</w:t>
-      </w:r>
-      <w:r>
-        <w:t>.</w:t>
-      </w:r>
-    </w:p>
-    <w:p>
-      <w:r>
-        <w:t xml:space="preserve">Le viste sono organizzate in modo gerarchico, è possibile definire scheletri strutturali globali (layout) che descrivono parti fisse dell’interfaccia, come </w:t>
-      </w:r>
-      <w:proofErr w:type="spellStart"/>
-      <w:r>
-        <w:t>header</w:t>
-      </w:r>
-      <w:proofErr w:type="spellEnd"/>
-      <w:r>
-        <w:t xml:space="preserve"> o </w:t>
-      </w:r>
-      <w:proofErr w:type="spellStart"/>
-      <w:r>
-        <w:t>footer</w:t>
-      </w:r>
-      <w:proofErr w:type="spellEnd"/>
-      <w:r>
-        <w:t>, che possono venir riutilizzati in ogni pagina</w:t>
+    </w:p>
+    <w:p>
+      <w:r>
+        <w:t>Le viste sono organizzate in modo gerarchico, è possibile definire scheletri strutturali globali (layout) che descrivono parti fisse dell’interfaccia, come header o footer, che possono venir riutilizzati in ogni pagina</w:t>
       </w:r>
       <w:r>
         <w:t>. Allo stesso modo</w:t>
@@ -436,15 +294,7 @@
         <w:t xml:space="preserve">La sintassi standard di Blade ({{ $variabile }}) sanifica automaticamente </w:t>
       </w:r>
       <w:r>
-        <w:t xml:space="preserve">l'output tramite </w:t>
-      </w:r>
-      <w:proofErr w:type="spellStart"/>
-      <w:r>
-        <w:t>htmlspecialchars</w:t>
-      </w:r>
-      <w:proofErr w:type="spellEnd"/>
-      <w:r>
-        <w:t xml:space="preserve">(), bloccando </w:t>
+        <w:t xml:space="preserve">l'output tramite htmlspecialchars(), bloccando </w:t>
       </w:r>
       <w:r>
         <w:t xml:space="preserve">all’origine </w:t>
@@ -479,7 +329,13 @@
     </w:p>
     <w:p>
       <w:r>
-        <w:t xml:space="preserve">Il Modello è incaricato di definire la struttura dei dati e di governare l’interazione concettuale con il database. Esso funziona tramite </w:t>
+        <w:t xml:space="preserve">Il </w:t>
+      </w:r>
+      <w:r>
+        <w:t>m</w:t>
+      </w:r>
+      <w:r>
+        <w:t xml:space="preserve">odello è incaricato di definire la struttura dei dati e di governare l’interazione concettuale con il database. Esso funziona tramite </w:t>
       </w:r>
       <w:r>
         <w:t>un’astrazione</w:t>
@@ -502,7 +358,13 @@
     </w:p>
     <w:p>
       <w:r>
-        <w:t>Il Modello, quindi, fornisce un’interfaccia ad alto livello per interrogare, modificare, o ricevere informazioni dal database attraverso metodi e oggetti software, senza dover scrivere manualmente istruzioni al database</w:t>
+        <w:t xml:space="preserve">Il </w:t>
+      </w:r>
+      <w:r>
+        <w:t>modello</w:t>
+      </w:r>
+      <w:r>
+        <w:t>, quindi, fornisce un’interfaccia ad alto livello per interrogare, modificare, o ricevere informazioni dal database attraverso metodi e oggetti software, senza dover scrivere manualmente istruzioni al database</w:t>
       </w:r>
       <w:r>
         <w:t xml:space="preserve"> </w:t>
@@ -550,7 +412,7 @@
         <w:t xml:space="preserve">Il </w:t>
       </w:r>
       <w:r>
-        <w:t>C</w:t>
+        <w:t>c</w:t>
       </w:r>
       <w:r>
         <w:t>ontroll</w:t>
@@ -568,30 +430,16 @@
         <w:t xml:space="preserve"> è il coordinatore fra i vari strati. </w:t>
       </w:r>
       <w:r>
-        <w:t xml:space="preserve">Invece di definire tutta la logica di gestione all'interno dei file di instradamento, </w:t>
-      </w:r>
-      <w:proofErr w:type="spellStart"/>
-      <w:r>
-        <w:t>Laravel</w:t>
-      </w:r>
-      <w:proofErr w:type="spellEnd"/>
-      <w:r>
-        <w:t xml:space="preserve"> incoraggia fortemente a raggruppare i comportamenti correlati all'interno di classi </w:t>
-      </w:r>
-      <w:r>
-        <w:t>C</w:t>
-      </w:r>
-      <w:r>
-        <w:t>ontrollore</w:t>
-      </w:r>
-      <w:r>
-        <w:t xml:space="preserve"> </w:t>
-      </w:r>
-      <w:r>
-        <w:t>dedicate</w:t>
-      </w:r>
-      <w:r>
-        <w:t xml:space="preserve">. </w:t>
+        <w:t xml:space="preserve">Invece di definire tutta la logica di gestione all'interno dei file di instradamento, Laravel incoraggia fortemente a raggruppare i comportamenti correlati all'interno di classi </w:t>
+      </w:r>
+      <w:r>
+        <w:t>c</w:t>
+      </w:r>
+      <w:r>
+        <w:t xml:space="preserve">ontrollore </w:t>
+      </w:r>
+      <w:r>
+        <w:t xml:space="preserve">dedicate. </w:t>
       </w:r>
       <w:r>
         <w:t>Esso h</w:t>
@@ -606,45 +454,22 @@
         <w:t>’</w:t>
       </w:r>
       <w:r>
-        <w:t>architettura full-</w:t>
-      </w:r>
-      <w:proofErr w:type="spellStart"/>
-      <w:r>
-        <w:t>stack</w:t>
-      </w:r>
-      <w:proofErr w:type="spellEnd"/>
-      <w:r>
-        <w:t xml:space="preserve"> </w:t>
-      </w:r>
-      <w:r>
-        <w:t xml:space="preserve">il </w:t>
-      </w:r>
-      <w:r>
-        <w:t>C</w:t>
-      </w:r>
-      <w:r>
-        <w:t>ontrollore</w:t>
-      </w:r>
-      <w:r>
-        <w:t xml:space="preserve"> </w:t>
-      </w:r>
-      <w:r>
-        <w:t>restituirà tipicamente un'istanza di una Vista Blade</w:t>
-      </w:r>
-      <w:r>
-        <w:t>, dopo aver</w:t>
-      </w:r>
-      <w:r>
-        <w:t xml:space="preserve"> interroga</w:t>
-      </w:r>
-      <w:r>
-        <w:t>to</w:t>
-      </w:r>
-      <w:r>
-        <w:t xml:space="preserve"> uno o più modelli</w:t>
-      </w:r>
-      <w:r>
-        <w:t xml:space="preserve"> per ottenere le relative informazioni. </w:t>
+        <w:t xml:space="preserve">architettura full-stack il </w:t>
+      </w:r>
+      <w:r>
+        <w:t>c</w:t>
+      </w:r>
+      <w:r>
+        <w:t xml:space="preserve">ontrollore </w:t>
+      </w:r>
+      <w:r>
+        <w:t xml:space="preserve">restituirà tipicamente un'istanza di una </w:t>
+      </w:r>
+      <w:r>
+        <w:t>v</w:t>
+      </w:r>
+      <w:r>
+        <w:t xml:space="preserve">ista Blade, dopo aver interrogato uno o più modelli per ottenere le relative informazioni. </w:t>
       </w:r>
     </w:p>
     <w:p>
@@ -652,7 +477,7 @@
         <w:t xml:space="preserve">I </w:t>
       </w:r>
       <w:r>
-        <w:t>C</w:t>
+        <w:t>c</w:t>
       </w:r>
       <w:r>
         <w:t>ontrollori</w:t>
@@ -664,21 +489,13 @@
         <w:t xml:space="preserve"> di solito</w:t>
       </w:r>
       <w:r>
-        <w:t xml:space="preserve"> basati su un’architettura delle risorse (</w:t>
-      </w:r>
-      <w:proofErr w:type="spellStart"/>
-      <w:r>
-        <w:t>R</w:t>
+        <w:t xml:space="preserve"> basati su un’architettura delle risorse (R</w:t>
       </w:r>
       <w:r>
         <w:t>EST</w:t>
       </w:r>
       <w:r>
-        <w:t>ful</w:t>
-      </w:r>
-      <w:proofErr w:type="spellEnd"/>
-      <w:r>
-        <w:t>), dove esistono metodi standard per un insieme standard di azioni (come visualizzare un singolo elemento, mostrare un elenco, eliminare un elemento, modificarlo, etc..). Questo ha lo scopo di standardizzare i controllori, così da rendere la logica interna pulita e prevedibile</w:t>
+        <w:t>ful), dove esistono metodi standard per un insieme standard di azioni (come visualizzare un singolo elemento, mostrare un elenco, eliminare un elemento, modificarlo, etc..). Questo ha lo scopo di standardizzare i controllori, così da rendere la logica interna pulita e prevedibile</w:t>
       </w:r>
       <w:r>
         <w:br/>
@@ -690,7 +507,7 @@
     </w:p>
     <w:p>
       <w:pPr>
-        <w:pStyle w:val="ListParagraph"/>
+        <w:pStyle w:val="Paragrafoelenco"/>
         <w:numPr>
           <w:ilvl w:val="0"/>
           <w:numId w:val="1"/>
@@ -705,20 +522,23 @@
     </w:p>
     <w:p>
       <w:pPr>
-        <w:pStyle w:val="ListParagraph"/>
+        <w:pStyle w:val="Paragrafoelenco"/>
         <w:numPr>
           <w:ilvl w:val="0"/>
           <w:numId w:val="1"/>
         </w:numPr>
       </w:pPr>
       <w:r>
-        <w:t>Il Controllore</w:t>
-      </w:r>
-      <w:r>
-        <w:t xml:space="preserve"> interroga uno o più </w:t>
-      </w:r>
-      <w:r>
-        <w:t>M</w:t>
+        <w:t xml:space="preserve">Il </w:t>
+      </w:r>
+      <w:r>
+        <w:t xml:space="preserve">controllore </w:t>
+      </w:r>
+      <w:r>
+        <w:t xml:space="preserve">interroga uno o più </w:t>
+      </w:r>
+      <w:r>
+        <w:t>m</w:t>
       </w:r>
       <w:r>
         <w:t xml:space="preserve">odelli per ottenere o modificare informazioni </w:t>
@@ -729,17 +549,29 @@
     </w:p>
     <w:p>
       <w:pPr>
-        <w:pStyle w:val="ListParagraph"/>
+        <w:pStyle w:val="Paragrafoelenco"/>
         <w:numPr>
           <w:ilvl w:val="0"/>
           <w:numId w:val="1"/>
         </w:numPr>
       </w:pPr>
       <w:r>
-        <w:t xml:space="preserve">Il Modello </w:t>
-      </w:r>
-      <w:r>
-        <w:t>esegue la logica d'affari e la persistenza dei dati, restituendo i risultati al Controllore.</w:t>
+        <w:t xml:space="preserve">Il </w:t>
+      </w:r>
+      <w:r>
+        <w:t>m</w:t>
+      </w:r>
+      <w:r>
+        <w:t xml:space="preserve">odello </w:t>
+      </w:r>
+      <w:r>
+        <w:t xml:space="preserve">esegue la logica d'affari e la persistenza dei dati, restituendo i risultati al </w:t>
+      </w:r>
+      <w:r>
+        <w:t>controllore</w:t>
+      </w:r>
+      <w:r>
+        <w:t>.</w:t>
       </w:r>
       <w:r>
         <w:t xml:space="preserve"> </w:t>
@@ -747,7 +579,7 @@
     </w:p>
     <w:p>
       <w:pPr>
-        <w:pStyle w:val="ListParagraph"/>
+        <w:pStyle w:val="Paragrafoelenco"/>
         <w:numPr>
           <w:ilvl w:val="0"/>
           <w:numId w:val="1"/>
@@ -760,16 +592,13 @@
         <w:t xml:space="preserve"> il </w:t>
       </w:r>
       <w:r>
-        <w:t>C</w:t>
-      </w:r>
-      <w:r>
-        <w:t>ontrollore</w:t>
-      </w:r>
-      <w:r>
-        <w:t xml:space="preserve"> assembla queste informazioni e le passa ad una </w:t>
-      </w:r>
-      <w:r>
-        <w:t>V</w:t>
+        <w:t xml:space="preserve">controllore </w:t>
+      </w:r>
+      <w:r>
+        <w:t xml:space="preserve">assembla queste informazioni e le passa ad una </w:t>
+      </w:r>
+      <w:r>
+        <w:t>v</w:t>
       </w:r>
       <w:r>
         <w:t>ista, che genera il risultato finale, da presentare all’utente</w:t>
@@ -778,49 +607,282 @@
         <w:t>.</w:t>
       </w:r>
     </w:p>
+    <w:p>
+      <w:r>
+        <w:rPr>
+          <w:noProof/>
+        </w:rPr>
+        <w:drawing>
+          <wp:inline distT="0" distB="0" distL="0" distR="0" wp14:anchorId="018E251D" wp14:editId="4C30103D">
+            <wp:extent cx="3360420" cy="2407174"/>
+            <wp:effectExtent l="0" t="0" r="0" b="0"/>
+            <wp:docPr id="87276654" name="Immagine 1" descr="Laravels MVC Structure"/>
+            <wp:cNvGraphicFramePr>
+              <a:graphicFrameLocks xmlns:a="http://schemas.openxmlformats.org/drawingml/2006/main" noChangeAspect="1"/>
+            </wp:cNvGraphicFramePr>
+            <a:graphic xmlns:a="http://schemas.openxmlformats.org/drawingml/2006/main">
+              <a:graphicData uri="http://schemas.openxmlformats.org/drawingml/2006/picture">
+                <pic:pic xmlns:pic="http://schemas.openxmlformats.org/drawingml/2006/picture">
+                  <pic:nvPicPr>
+                    <pic:cNvPr id="0" name="Picture 1" descr="Laravels MVC Structure"/>
+                    <pic:cNvPicPr>
+                      <a:picLocks noChangeAspect="1" noChangeArrowheads="1"/>
+                    </pic:cNvPicPr>
+                  </pic:nvPicPr>
+                  <pic:blipFill>
+                    <a:blip r:embed="rId5">
+                      <a:extLst>
+                        <a:ext uri="{28A0092B-C50C-407E-A947-70E740481C1C}">
+                          <a14:useLocalDpi xmlns:a14="http://schemas.microsoft.com/office/drawing/2010/main" val="0"/>
+                        </a:ext>
+                      </a:extLst>
+                    </a:blip>
+                    <a:srcRect/>
+                    <a:stretch>
+                      <a:fillRect/>
+                    </a:stretch>
+                  </pic:blipFill>
+                  <pic:spPr bwMode="auto">
+                    <a:xfrm>
+                      <a:off x="0" y="0"/>
+                      <a:ext cx="3367794" cy="2412456"/>
+                    </a:xfrm>
+                    <a:prstGeom prst="rect">
+                      <a:avLst/>
+                    </a:prstGeom>
+                    <a:noFill/>
+                    <a:ln>
+                      <a:noFill/>
+                    </a:ln>
+                  </pic:spPr>
+                </pic:pic>
+              </a:graphicData>
+            </a:graphic>
+          </wp:inline>
+        </w:drawing>
+      </w:r>
+      <w:r>
+        <w:t xml:space="preserve"> </w:t>
+      </w:r>
+      <w:r>
+        <w:t>https://www.geeksforgeeks.org/php/introduction-to-laravel-and-mvc-framework/</w:t>
+      </w:r>
+    </w:p>
     <w:p/>
     <w:p>
       <w:pPr>
-        <w:pStyle w:val="Heading2"/>
+        <w:pStyle w:val="Titolo2"/>
       </w:pPr>
       <w:r>
         <w:t xml:space="preserve">Il Ciclo di Vita della Richiesta </w:t>
       </w:r>
     </w:p>
     <w:p>
-      <w:pPr>
-        <w:pStyle w:val="Heading3"/>
-      </w:pPr>
-      <w:r>
-        <w:t>L'Inizializzazione e il Service Container</w:t>
-      </w:r>
-    </w:p>
-    <w:p/>
-    <w:p>
-      <w:pPr>
-        <w:pStyle w:val="Heading3"/>
+      <w:r>
+        <w:t xml:space="preserve">Il ciclo di vita della richiesta (Request Lifecycle) è il processo architetturale e temporale mediante il quale il framework Laravel intercetta una richiesta HTTP inviata da un client, inizializza l’ambiente di esecuzione, effettua i controlli di sicurezza e indirizza la richiesta verso la logica applicativa giusta, gestendo infine la restituzione della risposta. </w:t>
+      </w:r>
+    </w:p>
+    <w:p>
+      <w:pPr>
+        <w:pStyle w:val="Titolo3"/>
+      </w:pPr>
+      <w:r>
+        <w:t>Fase di Inizializzazione (Bootstrap)</w:t>
+      </w:r>
+    </w:p>
+    <w:p>
+      <w:r>
+        <w:t>Il ciclo di vita della richiesta ha inizio nel momento in cui il server web riceve una richiesta HTTP indirizzata all’applicazione</w:t>
+      </w:r>
+      <w:r>
+        <w:t xml:space="preserve">, che </w:t>
+      </w:r>
+      <w:r>
+        <w:t xml:space="preserve">convoglia tutte le richieste verso il file </w:t>
+      </w:r>
+      <w:r>
+        <w:t>public/index.php</w:t>
+      </w:r>
+      <w:r>
+        <w:t xml:space="preserve">. </w:t>
+      </w:r>
+      <w:r>
+        <w:t xml:space="preserve">Questo file è il punto di partenza per caricare il resto del framework. Ha il compito di caricare </w:t>
+      </w:r>
+      <w:r>
+        <w:t>la definizione dell’autoloader generata dal gestore di dipendenze Composer</w:t>
+      </w:r>
+      <w:r>
+        <w:t xml:space="preserve"> per poi istanziare la prima istanza dell’applicazione e del Service Container tramite </w:t>
+      </w:r>
+      <w:r>
+        <w:t>bootstrap/app.php</w:t>
+      </w:r>
+      <w:r>
+        <w:t>. Infine,</w:t>
+      </w:r>
+      <w:r>
+        <w:t xml:space="preserve"> l’applicazione assegna la gestione dell</w:t>
+      </w:r>
+      <w:r>
+        <w:t>e</w:t>
+      </w:r>
+      <w:r>
+        <w:t xml:space="preserve"> richiest</w:t>
+      </w:r>
+      <w:r>
+        <w:t xml:space="preserve">e </w:t>
+      </w:r>
+      <w:r>
+        <w:t>al Kernel HTTP</w:t>
+      </w:r>
+      <w:r>
+        <w:t xml:space="preserve">. Il Kernel esegue sempre una serie di bootstrapper prima che la richiesta venga effettivamente gestita, che </w:t>
+      </w:r>
+      <w:r>
+        <w:t>configurano la gestione degli errori, il logging, rilevano l'ambiente dell'applicazione e svolgono altre attività interne</w:t>
+      </w:r>
+      <w:r>
+        <w:t>.</w:t>
+      </w:r>
+    </w:p>
+    <w:p>
+      <w:r>
+        <w:t xml:space="preserve">In questa fase vengono anche caricati i Service Providers, </w:t>
+      </w:r>
+      <w:r>
+        <w:t>questi</w:t>
+      </w:r>
+      <w:r>
+        <w:t xml:space="preserve"> sono responsabili </w:t>
+      </w:r>
+      <w:r>
+        <w:t>dell’</w:t>
+      </w:r>
+      <w:r>
+        <w:t xml:space="preserve">inizializzazione </w:t>
+      </w:r>
+      <w:r>
+        <w:t>(</w:t>
+      </w:r>
+      <w:r>
+        <w:t>bootstrapping) di tutti i vari componenti del framework, come il database, le code, la validazione e il routing. Laravel itera attraverso l'elenco dei provide</w:t>
+      </w:r>
+      <w:r>
+        <w:t xml:space="preserve">r, </w:t>
+      </w:r>
+      <w:r>
+        <w:t>li istanzia, chiama il loro metodo register e successivamente, una volta tutti registrati, invoca il metodo boot.</w:t>
+      </w:r>
+      <w:r>
+        <w:t xml:space="preserve"> </w:t>
+      </w:r>
+    </w:p>
+    <w:p>
+      <w:pPr>
+        <w:pStyle w:val="Titolo3"/>
       </w:pPr>
       <w:r>
         <w:t>Filtrazione tramite Middleware</w:t>
       </w:r>
     </w:p>
     <w:p>
-      <w:pPr>
-        <w:pStyle w:val="Heading3"/>
+      <w:r>
+        <w:t xml:space="preserve">Il Kernel HTTP è anche responsabile del passaggio della richiesta attraverso lo stack di middleware dell’applicazione. Ogni middleware è una classe indipendente dotata di un metodo standard </w:t>
+      </w:r>
+      <w:r>
+        <w:t>handle($request, Closure $next</w:t>
+      </w:r>
+      <w:r>
+        <w:t xml:space="preserve">) e sono </w:t>
+      </w:r>
+      <w:r>
+        <w:t xml:space="preserve">sono un meccanismo per ispezionare, filtrare ed eventualmente respingere le richieste http </w:t>
+      </w:r>
+      <w:r>
+        <w:t>in entrata ed uscita</w:t>
+      </w:r>
+      <w:r>
+        <w:t>.</w:t>
+      </w:r>
+      <w:r>
+        <w:t xml:space="preserve"> Il passaggio della richiesta allo strato successivo è uniamente possibile, invocando </w:t>
+      </w:r>
+      <w:r>
+        <w:t>$next($request)</w:t>
+      </w:r>
+      <w:r>
+        <w:t>.</w:t>
+      </w:r>
+    </w:p>
+    <w:p>
+      <w:r>
+        <w:t xml:space="preserve">I middleware sono divisi in due categorie, i middleware globali, che rappresentano lo strato più esterno della pipeline e vengono eseguiti su ogni </w:t>
+      </w:r>
+      <w:r>
+        <w:t>richiesta http in ingresso ed il loro compito è validare lo stato globale dell’infrastruttura e i middleware di rotta, che sono filtri che vengono solo effettuati dopo c</w:t>
+      </w:r>
+      <w:r>
+        <w:t>he il framework ha analizzato l'URI della richiesta e ha determinato la rotta di destinazione</w:t>
+      </w:r>
+      <w:r>
+        <w:t xml:space="preserve">. In questa categoria appartengono i middleware come Authenticate che verificano che l’utente sia autorizzato o </w:t>
+      </w:r>
+      <w:r>
+        <w:t>VerifyCsrfToken</w:t>
+      </w:r>
+      <w:r>
+        <w:t xml:space="preserve">, che implementa la difesa contro attacchi </w:t>
+      </w:r>
+      <w:r>
+        <w:t>Cross-Site Request Forgery</w:t>
+      </w:r>
+      <w:r>
+        <w:t xml:space="preserve">. </w:t>
+      </w:r>
+      <w:r>
+        <w:br/>
+      </w:r>
+    </w:p>
+    <w:p>
+      <w:pPr>
+        <w:pStyle w:val="Titolo3"/>
       </w:pPr>
       <w:r>
         <w:t>L'Instradamento tramite Routing</w:t>
       </w:r>
     </w:p>
-    <w:p/>
-    <w:p/>
-    <w:p>
-      <w:pPr>
-        <w:pStyle w:val="Heading2"/>
-      </w:pPr>
+    <w:p>
+      <w:r>
+        <w:t xml:space="preserve">Dopo che la richiesta supera i middleware globali, la richiesta viene consagnata al router per l’instradamento. </w:t>
+      </w:r>
+      <w:r>
+        <w:t>Le rotte di base di Laravel accettano un URI e una closure (o un controller) e sono definite all'interno dei file presenti nella directory routes</w:t>
+      </w:r>
+      <w:r>
+        <w:t xml:space="preserve">. </w:t>
+      </w:r>
+    </w:p>
+    <w:p>
+      <w:r>
+        <w:t>Il router esamina l'URI in ingresso e lo fa corrispondere a una rotta definita, eseguendo contestualmente eventuali middleware specifici assegnati a quella rotta o a quel gruppo di rotte. Se la richiesta supera con successo tutti i middleware assegnati, viene eseguito il metodo del controller associato o la closure della rotta.</w:t>
+      </w:r>
+    </w:p>
+    <w:p>
+      <w:r>
+        <w:t xml:space="preserve">L'esecuzione della rotta o del controller genera infine una risposta HTTP. Questa risposta compie un viaggio a ritroso passando nuovamente attraverso la catena di middleware della rotta, dando all'applicazione la </w:t>
+      </w:r>
       <w:r>
         <w:lastRenderedPageBreak/>
-        <w:t>Disaccoppiamento della Logica: Il Service Layer</w:t>
+        <w:t>possibilità di modificare o esaminare la risposta in uscita. Infine, il metodo handle del Kernel HTTP restituisce l'oggetto risposta, e il contenuto viene inviato al browser dell'utente, concludendo così il ciclo di vita della richiesta</w:t>
+      </w:r>
+    </w:p>
+    <w:p>
+      <w:pPr>
+        <w:pStyle w:val="Titolo2"/>
+      </w:pPr>
+      <w:r>
+        <w:t>Il Service Layer</w:t>
       </w:r>
     </w:p>
     <w:sectPr>
@@ -921,8 +983,124 @@
       </w:pPr>
     </w:lvl>
   </w:abstractNum>
+  <w:abstractNum w:abstractNumId="1" w15:restartNumberingAfterBreak="0">
+    <w:nsid w:val="3FEE5382"/>
+    <w:multiLevelType w:val="hybridMultilevel"/>
+    <w:tmpl w:val="EC0E807E"/>
+    <w:lvl w:ilvl="0" w:tplc="04100001">
+      <w:start w:val="1"/>
+      <w:numFmt w:val="bullet"/>
+      <w:lvlText w:val=""/>
+      <w:lvlJc w:val="left"/>
+      <w:pPr>
+        <w:ind w:left="720" w:hanging="360"/>
+      </w:pPr>
+      <w:rPr>
+        <w:rFonts w:ascii="Symbol" w:hAnsi="Symbol" w:hint="default"/>
+      </w:rPr>
+    </w:lvl>
+    <w:lvl w:ilvl="1" w:tplc="04100003" w:tentative="1">
+      <w:start w:val="1"/>
+      <w:numFmt w:val="bullet"/>
+      <w:lvlText w:val="o"/>
+      <w:lvlJc w:val="left"/>
+      <w:pPr>
+        <w:ind w:left="1440" w:hanging="360"/>
+      </w:pPr>
+      <w:rPr>
+        <w:rFonts w:ascii="Courier New" w:hAnsi="Courier New" w:cs="Courier New" w:hint="default"/>
+      </w:rPr>
+    </w:lvl>
+    <w:lvl w:ilvl="2" w:tplc="04100005" w:tentative="1">
+      <w:start w:val="1"/>
+      <w:numFmt w:val="bullet"/>
+      <w:lvlText w:val=""/>
+      <w:lvlJc w:val="left"/>
+      <w:pPr>
+        <w:ind w:left="2160" w:hanging="360"/>
+      </w:pPr>
+      <w:rPr>
+        <w:rFonts w:ascii="Wingdings" w:hAnsi="Wingdings" w:hint="default"/>
+      </w:rPr>
+    </w:lvl>
+    <w:lvl w:ilvl="3" w:tplc="04100001" w:tentative="1">
+      <w:start w:val="1"/>
+      <w:numFmt w:val="bullet"/>
+      <w:lvlText w:val=""/>
+      <w:lvlJc w:val="left"/>
+      <w:pPr>
+        <w:ind w:left="2880" w:hanging="360"/>
+      </w:pPr>
+      <w:rPr>
+        <w:rFonts w:ascii="Symbol" w:hAnsi="Symbol" w:hint="default"/>
+      </w:rPr>
+    </w:lvl>
+    <w:lvl w:ilvl="4" w:tplc="04100003" w:tentative="1">
+      <w:start w:val="1"/>
+      <w:numFmt w:val="bullet"/>
+      <w:lvlText w:val="o"/>
+      <w:lvlJc w:val="left"/>
+      <w:pPr>
+        <w:ind w:left="3600" w:hanging="360"/>
+      </w:pPr>
+      <w:rPr>
+        <w:rFonts w:ascii="Courier New" w:hAnsi="Courier New" w:cs="Courier New" w:hint="default"/>
+      </w:rPr>
+    </w:lvl>
+    <w:lvl w:ilvl="5" w:tplc="04100005" w:tentative="1">
+      <w:start w:val="1"/>
+      <w:numFmt w:val="bullet"/>
+      <w:lvlText w:val=""/>
+      <w:lvlJc w:val="left"/>
+      <w:pPr>
+        <w:ind w:left="4320" w:hanging="360"/>
+      </w:pPr>
+      <w:rPr>
+        <w:rFonts w:ascii="Wingdings" w:hAnsi="Wingdings" w:hint="default"/>
+      </w:rPr>
+    </w:lvl>
+    <w:lvl w:ilvl="6" w:tplc="04100001" w:tentative="1">
+      <w:start w:val="1"/>
+      <w:numFmt w:val="bullet"/>
+      <w:lvlText w:val=""/>
+      <w:lvlJc w:val="left"/>
+      <w:pPr>
+        <w:ind w:left="5040" w:hanging="360"/>
+      </w:pPr>
+      <w:rPr>
+        <w:rFonts w:ascii="Symbol" w:hAnsi="Symbol" w:hint="default"/>
+      </w:rPr>
+    </w:lvl>
+    <w:lvl w:ilvl="7" w:tplc="04100003" w:tentative="1">
+      <w:start w:val="1"/>
+      <w:numFmt w:val="bullet"/>
+      <w:lvlText w:val="o"/>
+      <w:lvlJc w:val="left"/>
+      <w:pPr>
+        <w:ind w:left="5760" w:hanging="360"/>
+      </w:pPr>
+      <w:rPr>
+        <w:rFonts w:ascii="Courier New" w:hAnsi="Courier New" w:cs="Courier New" w:hint="default"/>
+      </w:rPr>
+    </w:lvl>
+    <w:lvl w:ilvl="8" w:tplc="04100005" w:tentative="1">
+      <w:start w:val="1"/>
+      <w:numFmt w:val="bullet"/>
+      <w:lvlText w:val=""/>
+      <w:lvlJc w:val="left"/>
+      <w:pPr>
+        <w:ind w:left="6480" w:hanging="360"/>
+      </w:pPr>
+      <w:rPr>
+        <w:rFonts w:ascii="Wingdings" w:hAnsi="Wingdings" w:hint="default"/>
+      </w:rPr>
+    </w:lvl>
+  </w:abstractNum>
   <w:num w:numId="1" w16cid:durableId="87777417">
     <w:abstractNumId w:val="0"/>
+  </w:num>
+  <w:num w:numId="2" w16cid:durableId="115030261">
+    <w:abstractNumId w:val="1"/>
   </w:num>
 </w:numbering>
 </file>
@@ -1324,15 +1502,15 @@
     <w:lsdException w:name="Unresolved Mention" w:semiHidden="1" w:unhideWhenUsed="1"/>
     <w:lsdException w:name="Smart Link" w:semiHidden="1" w:unhideWhenUsed="1"/>
   </w:latentStyles>
-  <w:style w:type="paragraph" w:default="1" w:styleId="Normal">
+  <w:style w:type="paragraph" w:default="1" w:styleId="Normale">
     <w:name w:val="Normal"/>
     <w:qFormat/>
   </w:style>
-  <w:style w:type="paragraph" w:styleId="Heading1">
+  <w:style w:type="paragraph" w:styleId="Titolo1">
     <w:name w:val="heading 1"/>
-    <w:basedOn w:val="Normal"/>
-    <w:next w:val="Normal"/>
-    <w:link w:val="Heading1Char"/>
+    <w:basedOn w:val="Normale"/>
+    <w:next w:val="Normale"/>
+    <w:link w:val="Titolo1Carattere"/>
     <w:uiPriority w:val="9"/>
     <w:qFormat/>
     <w:rsid w:val="00574B2B"/>
@@ -1349,11 +1527,11 @@
       <w:szCs w:val="40"/>
     </w:rPr>
   </w:style>
-  <w:style w:type="paragraph" w:styleId="Heading2">
+  <w:style w:type="paragraph" w:styleId="Titolo2">
     <w:name w:val="heading 2"/>
-    <w:basedOn w:val="Normal"/>
-    <w:next w:val="Normal"/>
-    <w:link w:val="Heading2Char"/>
+    <w:basedOn w:val="Normale"/>
+    <w:next w:val="Normale"/>
+    <w:link w:val="Titolo2Carattere"/>
     <w:uiPriority w:val="9"/>
     <w:unhideWhenUsed/>
     <w:qFormat/>
@@ -1371,11 +1549,11 @@
       <w:szCs w:val="32"/>
     </w:rPr>
   </w:style>
-  <w:style w:type="paragraph" w:styleId="Heading3">
+  <w:style w:type="paragraph" w:styleId="Titolo3">
     <w:name w:val="heading 3"/>
-    <w:basedOn w:val="Normal"/>
-    <w:next w:val="Normal"/>
-    <w:link w:val="Heading3Char"/>
+    <w:basedOn w:val="Normale"/>
+    <w:next w:val="Normale"/>
+    <w:link w:val="Titolo3Carattere"/>
     <w:uiPriority w:val="9"/>
     <w:unhideWhenUsed/>
     <w:qFormat/>
@@ -1393,11 +1571,11 @@
       <w:szCs w:val="28"/>
     </w:rPr>
   </w:style>
-  <w:style w:type="paragraph" w:styleId="Heading4">
+  <w:style w:type="paragraph" w:styleId="Titolo4">
     <w:name w:val="heading 4"/>
-    <w:basedOn w:val="Normal"/>
-    <w:next w:val="Normal"/>
-    <w:link w:val="Heading4Char"/>
+    <w:basedOn w:val="Normale"/>
+    <w:next w:val="Normale"/>
+    <w:link w:val="Titolo4Carattere"/>
     <w:uiPriority w:val="9"/>
     <w:semiHidden/>
     <w:unhideWhenUsed/>
@@ -1416,11 +1594,11 @@
       <w:color w:val="2F5496" w:themeColor="accent1" w:themeShade="BF"/>
     </w:rPr>
   </w:style>
-  <w:style w:type="paragraph" w:styleId="Heading5">
+  <w:style w:type="paragraph" w:styleId="Titolo5">
     <w:name w:val="heading 5"/>
-    <w:basedOn w:val="Normal"/>
-    <w:next w:val="Normal"/>
-    <w:link w:val="Heading5Char"/>
+    <w:basedOn w:val="Normale"/>
+    <w:next w:val="Normale"/>
+    <w:link w:val="Titolo5Carattere"/>
     <w:uiPriority w:val="9"/>
     <w:semiHidden/>
     <w:unhideWhenUsed/>
@@ -1437,11 +1615,11 @@
       <w:color w:val="2F5496" w:themeColor="accent1" w:themeShade="BF"/>
     </w:rPr>
   </w:style>
-  <w:style w:type="paragraph" w:styleId="Heading6">
+  <w:style w:type="paragraph" w:styleId="Titolo6">
     <w:name w:val="heading 6"/>
-    <w:basedOn w:val="Normal"/>
-    <w:next w:val="Normal"/>
-    <w:link w:val="Heading6Char"/>
+    <w:basedOn w:val="Normale"/>
+    <w:next w:val="Normale"/>
+    <w:link w:val="Titolo6Carattere"/>
     <w:uiPriority w:val="9"/>
     <w:semiHidden/>
     <w:unhideWhenUsed/>
@@ -1460,11 +1638,11 @@
       <w:color w:val="595959" w:themeColor="text1" w:themeTint="A6"/>
     </w:rPr>
   </w:style>
-  <w:style w:type="paragraph" w:styleId="Heading7">
+  <w:style w:type="paragraph" w:styleId="Titolo7">
     <w:name w:val="heading 7"/>
-    <w:basedOn w:val="Normal"/>
-    <w:next w:val="Normal"/>
-    <w:link w:val="Heading7Char"/>
+    <w:basedOn w:val="Normale"/>
+    <w:next w:val="Normale"/>
+    <w:link w:val="Titolo7Carattere"/>
     <w:uiPriority w:val="9"/>
     <w:semiHidden/>
     <w:unhideWhenUsed/>
@@ -1481,11 +1659,11 @@
       <w:color w:val="595959" w:themeColor="text1" w:themeTint="A6"/>
     </w:rPr>
   </w:style>
-  <w:style w:type="paragraph" w:styleId="Heading8">
+  <w:style w:type="paragraph" w:styleId="Titolo8">
     <w:name w:val="heading 8"/>
-    <w:basedOn w:val="Normal"/>
-    <w:next w:val="Normal"/>
-    <w:link w:val="Heading8Char"/>
+    <w:basedOn w:val="Normale"/>
+    <w:next w:val="Normale"/>
+    <w:link w:val="Titolo8Carattere"/>
     <w:uiPriority w:val="9"/>
     <w:semiHidden/>
     <w:unhideWhenUsed/>
@@ -1504,11 +1682,11 @@
       <w:color w:val="272727" w:themeColor="text1" w:themeTint="D8"/>
     </w:rPr>
   </w:style>
-  <w:style w:type="paragraph" w:styleId="Heading9">
+  <w:style w:type="paragraph" w:styleId="Titolo9">
     <w:name w:val="heading 9"/>
-    <w:basedOn w:val="Normal"/>
-    <w:next w:val="Normal"/>
-    <w:link w:val="Heading9Char"/>
+    <w:basedOn w:val="Normale"/>
+    <w:next w:val="Normale"/>
+    <w:link w:val="Titolo9Carattere"/>
     <w:uiPriority w:val="9"/>
     <w:semiHidden/>
     <w:unhideWhenUsed/>
@@ -1525,12 +1703,12 @@
       <w:color w:val="272727" w:themeColor="text1" w:themeTint="D8"/>
     </w:rPr>
   </w:style>
-  <w:style w:type="character" w:default="1" w:styleId="DefaultParagraphFont">
+  <w:style w:type="character" w:default="1" w:styleId="Carpredefinitoparagrafo">
     <w:name w:val="Default Paragraph Font"/>
     <w:uiPriority w:val="1"/>
     <w:unhideWhenUsed/>
   </w:style>
-  <w:style w:type="table" w:default="1" w:styleId="TableNormal">
+  <w:style w:type="table" w:default="1" w:styleId="Tabellanormale">
     <w:name w:val="Normal Table"/>
     <w:uiPriority w:val="99"/>
     <w:semiHidden/>
@@ -1545,16 +1723,16 @@
       </w:tblCellMar>
     </w:tblPr>
   </w:style>
-  <w:style w:type="numbering" w:default="1" w:styleId="NoList">
+  <w:style w:type="numbering" w:default="1" w:styleId="Nessunelenco">
     <w:name w:val="No List"/>
     <w:uiPriority w:val="99"/>
     <w:semiHidden/>
     <w:unhideWhenUsed/>
   </w:style>
-  <w:style w:type="character" w:customStyle="1" w:styleId="Heading1Char">
-    <w:name w:val="Heading 1 Char"/>
-    <w:basedOn w:val="DefaultParagraphFont"/>
-    <w:link w:val="Heading1"/>
+  <w:style w:type="character" w:customStyle="1" w:styleId="Titolo1Carattere">
+    <w:name w:val="Titolo 1 Carattere"/>
+    <w:basedOn w:val="Carpredefinitoparagrafo"/>
+    <w:link w:val="Titolo1"/>
     <w:uiPriority w:val="9"/>
     <w:rsid w:val="00574B2B"/>
     <w:rPr>
@@ -1564,10 +1742,10 @@
       <w:szCs w:val="40"/>
     </w:rPr>
   </w:style>
-  <w:style w:type="character" w:customStyle="1" w:styleId="Heading2Char">
-    <w:name w:val="Heading 2 Char"/>
-    <w:basedOn w:val="DefaultParagraphFont"/>
-    <w:link w:val="Heading2"/>
+  <w:style w:type="character" w:customStyle="1" w:styleId="Titolo2Carattere">
+    <w:name w:val="Titolo 2 Carattere"/>
+    <w:basedOn w:val="Carpredefinitoparagrafo"/>
+    <w:link w:val="Titolo2"/>
     <w:uiPriority w:val="9"/>
     <w:rsid w:val="00574B2B"/>
     <w:rPr>
@@ -1577,10 +1755,10 @@
       <w:szCs w:val="32"/>
     </w:rPr>
   </w:style>
-  <w:style w:type="character" w:customStyle="1" w:styleId="Heading3Char">
-    <w:name w:val="Heading 3 Char"/>
-    <w:basedOn w:val="DefaultParagraphFont"/>
-    <w:link w:val="Heading3"/>
+  <w:style w:type="character" w:customStyle="1" w:styleId="Titolo3Carattere">
+    <w:name w:val="Titolo 3 Carattere"/>
+    <w:basedOn w:val="Carpredefinitoparagrafo"/>
+    <w:link w:val="Titolo3"/>
     <w:uiPriority w:val="9"/>
     <w:rsid w:val="00574B2B"/>
     <w:rPr>
@@ -1590,10 +1768,10 @@
       <w:szCs w:val="28"/>
     </w:rPr>
   </w:style>
-  <w:style w:type="character" w:customStyle="1" w:styleId="Heading4Char">
-    <w:name w:val="Heading 4 Char"/>
-    <w:basedOn w:val="DefaultParagraphFont"/>
-    <w:link w:val="Heading4"/>
+  <w:style w:type="character" w:customStyle="1" w:styleId="Titolo4Carattere">
+    <w:name w:val="Titolo 4 Carattere"/>
+    <w:basedOn w:val="Carpredefinitoparagrafo"/>
+    <w:link w:val="Titolo4"/>
     <w:uiPriority w:val="9"/>
     <w:semiHidden/>
     <w:rsid w:val="00574B2B"/>
@@ -1604,10 +1782,10 @@
       <w:color w:val="2F5496" w:themeColor="accent1" w:themeShade="BF"/>
     </w:rPr>
   </w:style>
-  <w:style w:type="character" w:customStyle="1" w:styleId="Heading5Char">
-    <w:name w:val="Heading 5 Char"/>
-    <w:basedOn w:val="DefaultParagraphFont"/>
-    <w:link w:val="Heading5"/>
+  <w:style w:type="character" w:customStyle="1" w:styleId="Titolo5Carattere">
+    <w:name w:val="Titolo 5 Carattere"/>
+    <w:basedOn w:val="Carpredefinitoparagrafo"/>
+    <w:link w:val="Titolo5"/>
     <w:uiPriority w:val="9"/>
     <w:semiHidden/>
     <w:rsid w:val="00574B2B"/>
@@ -1616,10 +1794,10 @@
       <w:color w:val="2F5496" w:themeColor="accent1" w:themeShade="BF"/>
     </w:rPr>
   </w:style>
-  <w:style w:type="character" w:customStyle="1" w:styleId="Heading6Char">
-    <w:name w:val="Heading 6 Char"/>
-    <w:basedOn w:val="DefaultParagraphFont"/>
-    <w:link w:val="Heading6"/>
+  <w:style w:type="character" w:customStyle="1" w:styleId="Titolo6Carattere">
+    <w:name w:val="Titolo 6 Carattere"/>
+    <w:basedOn w:val="Carpredefinitoparagrafo"/>
+    <w:link w:val="Titolo6"/>
     <w:uiPriority w:val="9"/>
     <w:semiHidden/>
     <w:rsid w:val="00574B2B"/>
@@ -1630,10 +1808,10 @@
       <w:color w:val="595959" w:themeColor="text1" w:themeTint="A6"/>
     </w:rPr>
   </w:style>
-  <w:style w:type="character" w:customStyle="1" w:styleId="Heading7Char">
-    <w:name w:val="Heading 7 Char"/>
-    <w:basedOn w:val="DefaultParagraphFont"/>
-    <w:link w:val="Heading7"/>
+  <w:style w:type="character" w:customStyle="1" w:styleId="Titolo7Carattere">
+    <w:name w:val="Titolo 7 Carattere"/>
+    <w:basedOn w:val="Carpredefinitoparagrafo"/>
+    <w:link w:val="Titolo7"/>
     <w:uiPriority w:val="9"/>
     <w:semiHidden/>
     <w:rsid w:val="00574B2B"/>
@@ -1642,10 +1820,10 @@
       <w:color w:val="595959" w:themeColor="text1" w:themeTint="A6"/>
     </w:rPr>
   </w:style>
-  <w:style w:type="character" w:customStyle="1" w:styleId="Heading8Char">
-    <w:name w:val="Heading 8 Char"/>
-    <w:basedOn w:val="DefaultParagraphFont"/>
-    <w:link w:val="Heading8"/>
+  <w:style w:type="character" w:customStyle="1" w:styleId="Titolo8Carattere">
+    <w:name w:val="Titolo 8 Carattere"/>
+    <w:basedOn w:val="Carpredefinitoparagrafo"/>
+    <w:link w:val="Titolo8"/>
     <w:uiPriority w:val="9"/>
     <w:semiHidden/>
     <w:rsid w:val="00574B2B"/>
@@ -1656,10 +1834,10 @@
       <w:color w:val="272727" w:themeColor="text1" w:themeTint="D8"/>
     </w:rPr>
   </w:style>
-  <w:style w:type="character" w:customStyle="1" w:styleId="Heading9Char">
-    <w:name w:val="Heading 9 Char"/>
-    <w:basedOn w:val="DefaultParagraphFont"/>
-    <w:link w:val="Heading9"/>
+  <w:style w:type="character" w:customStyle="1" w:styleId="Titolo9Carattere">
+    <w:name w:val="Titolo 9 Carattere"/>
+    <w:basedOn w:val="Carpredefinitoparagrafo"/>
+    <w:link w:val="Titolo9"/>
     <w:uiPriority w:val="9"/>
     <w:semiHidden/>
     <w:rsid w:val="00574B2B"/>
@@ -1668,11 +1846,11 @@
       <w:color w:val="272727" w:themeColor="text1" w:themeTint="D8"/>
     </w:rPr>
   </w:style>
-  <w:style w:type="paragraph" w:styleId="Title">
+  <w:style w:type="paragraph" w:styleId="Titolo">
     <w:name w:val="Title"/>
-    <w:basedOn w:val="Normal"/>
-    <w:next w:val="Normal"/>
-    <w:link w:val="TitleChar"/>
+    <w:basedOn w:val="Normale"/>
+    <w:next w:val="Normale"/>
+    <w:link w:val="TitoloCarattere"/>
     <w:uiPriority w:val="10"/>
     <w:qFormat/>
     <w:rsid w:val="00574B2B"/>
@@ -1688,10 +1866,10 @@
       <w:szCs w:val="56"/>
     </w:rPr>
   </w:style>
-  <w:style w:type="character" w:customStyle="1" w:styleId="TitleChar">
-    <w:name w:val="Title Char"/>
-    <w:basedOn w:val="DefaultParagraphFont"/>
-    <w:link w:val="Title"/>
+  <w:style w:type="character" w:customStyle="1" w:styleId="TitoloCarattere">
+    <w:name w:val="Titolo Carattere"/>
+    <w:basedOn w:val="Carpredefinitoparagrafo"/>
+    <w:link w:val="Titolo"/>
     <w:uiPriority w:val="10"/>
     <w:rsid w:val="00574B2B"/>
     <w:rPr>
@@ -1702,11 +1880,11 @@
       <w:szCs w:val="56"/>
     </w:rPr>
   </w:style>
-  <w:style w:type="paragraph" w:styleId="Subtitle">
+  <w:style w:type="paragraph" w:styleId="Sottotitolo">
     <w:name w:val="Subtitle"/>
-    <w:basedOn w:val="Normal"/>
-    <w:next w:val="Normal"/>
-    <w:link w:val="SubtitleChar"/>
+    <w:basedOn w:val="Normale"/>
+    <w:next w:val="Normale"/>
+    <w:link w:val="SottotitoloCarattere"/>
     <w:uiPriority w:val="11"/>
     <w:qFormat/>
     <w:rsid w:val="00574B2B"/>
@@ -1723,10 +1901,10 @@
       <w:szCs w:val="28"/>
     </w:rPr>
   </w:style>
-  <w:style w:type="character" w:customStyle="1" w:styleId="SubtitleChar">
-    <w:name w:val="Subtitle Char"/>
-    <w:basedOn w:val="DefaultParagraphFont"/>
-    <w:link w:val="Subtitle"/>
+  <w:style w:type="character" w:customStyle="1" w:styleId="SottotitoloCarattere">
+    <w:name w:val="Sottotitolo Carattere"/>
+    <w:basedOn w:val="Carpredefinitoparagrafo"/>
+    <w:link w:val="Sottotitolo"/>
     <w:uiPriority w:val="11"/>
     <w:rsid w:val="00574B2B"/>
     <w:rPr>
@@ -1737,11 +1915,11 @@
       <w:szCs w:val="28"/>
     </w:rPr>
   </w:style>
-  <w:style w:type="paragraph" w:styleId="Quote">
+  <w:style w:type="paragraph" w:styleId="Citazione">
     <w:name w:val="Quote"/>
-    <w:basedOn w:val="Normal"/>
-    <w:next w:val="Normal"/>
-    <w:link w:val="QuoteChar"/>
+    <w:basedOn w:val="Normale"/>
+    <w:next w:val="Normale"/>
+    <w:link w:val="CitazioneCarattere"/>
     <w:uiPriority w:val="29"/>
     <w:qFormat/>
     <w:rsid w:val="00574B2B"/>
@@ -1755,10 +1933,10 @@
       <w:color w:val="404040" w:themeColor="text1" w:themeTint="BF"/>
     </w:rPr>
   </w:style>
-  <w:style w:type="character" w:customStyle="1" w:styleId="QuoteChar">
-    <w:name w:val="Quote Char"/>
-    <w:basedOn w:val="DefaultParagraphFont"/>
-    <w:link w:val="Quote"/>
+  <w:style w:type="character" w:customStyle="1" w:styleId="CitazioneCarattere">
+    <w:name w:val="Citazione Carattere"/>
+    <w:basedOn w:val="Carpredefinitoparagrafo"/>
+    <w:link w:val="Citazione"/>
     <w:uiPriority w:val="29"/>
     <w:rsid w:val="00574B2B"/>
     <w:rPr>
@@ -1767,9 +1945,9 @@
       <w:color w:val="404040" w:themeColor="text1" w:themeTint="BF"/>
     </w:rPr>
   </w:style>
-  <w:style w:type="paragraph" w:styleId="ListParagraph">
+  <w:style w:type="paragraph" w:styleId="Paragrafoelenco">
     <w:name w:val="List Paragraph"/>
-    <w:basedOn w:val="Normal"/>
+    <w:basedOn w:val="Normale"/>
     <w:uiPriority w:val="34"/>
     <w:qFormat/>
     <w:rsid w:val="00574B2B"/>
@@ -1778,9 +1956,9 @@
       <w:contextualSpacing/>
     </w:pPr>
   </w:style>
-  <w:style w:type="character" w:styleId="IntenseEmphasis">
+  <w:style w:type="character" w:styleId="Enfasiintensa">
     <w:name w:val="Intense Emphasis"/>
-    <w:basedOn w:val="DefaultParagraphFont"/>
+    <w:basedOn w:val="Carpredefinitoparagrafo"/>
     <w:uiPriority w:val="21"/>
     <w:qFormat/>
     <w:rsid w:val="00574B2B"/>
@@ -1790,11 +1968,11 @@
       <w:color w:val="2F5496" w:themeColor="accent1" w:themeShade="BF"/>
     </w:rPr>
   </w:style>
-  <w:style w:type="paragraph" w:styleId="IntenseQuote">
+  <w:style w:type="paragraph" w:styleId="Citazioneintensa">
     <w:name w:val="Intense Quote"/>
-    <w:basedOn w:val="Normal"/>
-    <w:next w:val="Normal"/>
-    <w:link w:val="IntenseQuoteChar"/>
+    <w:basedOn w:val="Normale"/>
+    <w:next w:val="Normale"/>
+    <w:link w:val="CitazioneintensaCarattere"/>
     <w:uiPriority w:val="30"/>
     <w:qFormat/>
     <w:rsid w:val="00574B2B"/>
@@ -1813,10 +1991,10 @@
       <w:color w:val="2F5496" w:themeColor="accent1" w:themeShade="BF"/>
     </w:rPr>
   </w:style>
-  <w:style w:type="character" w:customStyle="1" w:styleId="IntenseQuoteChar">
-    <w:name w:val="Intense Quote Char"/>
-    <w:basedOn w:val="DefaultParagraphFont"/>
-    <w:link w:val="IntenseQuote"/>
+  <w:style w:type="character" w:customStyle="1" w:styleId="CitazioneintensaCarattere">
+    <w:name w:val="Citazione intensa Carattere"/>
+    <w:basedOn w:val="Carpredefinitoparagrafo"/>
+    <w:link w:val="Citazioneintensa"/>
     <w:uiPriority w:val="30"/>
     <w:rsid w:val="00574B2B"/>
     <w:rPr>
@@ -1825,9 +2003,9 @@
       <w:color w:val="2F5496" w:themeColor="accent1" w:themeShade="BF"/>
     </w:rPr>
   </w:style>
-  <w:style w:type="character" w:styleId="IntenseReference">
+  <w:style w:type="character" w:styleId="Riferimentointenso">
     <w:name w:val="Intense Reference"/>
-    <w:basedOn w:val="DefaultParagraphFont"/>
+    <w:basedOn w:val="Carpredefinitoparagrafo"/>
     <w:uiPriority w:val="32"/>
     <w:qFormat/>
     <w:rsid w:val="00574B2B"/>

</xml_diff>